<commit_message>
Rename: Ronish-xx-lab-title to xx-Ronish-lab-title
</commit_message>
<xml_diff>
--- a/Labs/Ronish_Java_Lab_Report.docx
+++ b/Labs/Ronish_Java_Lab_Report.docx
@@ -32,6 +32,56 @@
       <w:pPr>
         <w:pStyle w:val="Heading2"/>
       </w:pPr>
+      <w:r>
+        <w:t>File Explorer</w:t>
+      </w:r>
+    </w:p>
+    <w:p>
+      <w:pPr>
+        <w:pStyle w:val="BodyText"/>
+      </w:pPr>
+      <w:r>
+        <w:drawing>
+          <wp:inline distT="0" distB="0" distL="0" distR="0" wp14:anchorId="138FC9A8" wp14:editId="0E37DEEB">
+            <wp:extent cx="3398815" cy="2179509"/>
+            <wp:effectExtent l="0" t="0" r="0" b="0"/>
+            <wp:docPr id="513717586" name="Picture 1"/>
+            <wp:cNvGraphicFramePr>
+              <a:graphicFrameLocks xmlns:a="http://schemas.openxmlformats.org/drawingml/2006/main" noChangeAspect="1"/>
+            </wp:cNvGraphicFramePr>
+            <a:graphic xmlns:a="http://schemas.openxmlformats.org/drawingml/2006/main">
+              <a:graphicData uri="http://schemas.openxmlformats.org/drawingml/2006/picture">
+                <pic:pic xmlns:pic="http://schemas.openxmlformats.org/drawingml/2006/picture">
+                  <pic:nvPicPr>
+                    <pic:cNvPr id="513717586" name=""/>
+                    <pic:cNvPicPr/>
+                  </pic:nvPicPr>
+                  <pic:blipFill>
+                    <a:blip r:embed="rId8"/>
+                    <a:stretch>
+                      <a:fillRect/>
+                    </a:stretch>
+                  </pic:blipFill>
+                  <pic:spPr>
+                    <a:xfrm>
+                      <a:off x="0" y="0"/>
+                      <a:ext cx="3398815" cy="2179509"/>
+                    </a:xfrm>
+                    <a:prstGeom prst="rect">
+                      <a:avLst/>
+                    </a:prstGeom>
+                  </pic:spPr>
+                </pic:pic>
+              </a:graphicData>
+            </a:graphic>
+          </wp:inline>
+        </w:drawing>
+      </w:r>
+    </w:p>
+    <w:p>
+      <w:pPr>
+        <w:pStyle w:val="Heading2"/>
+      </w:pPr>
       <w:bookmarkStart w:id="2" w:name="source-code"/>
       <w:bookmarkEnd w:id="1"/>
       <w:r>
@@ -1420,6 +1470,7 @@
         <w:br/>
       </w:r>
       <w:r>
+        <w:lastRenderedPageBreak/>
         <w:br/>
       </w:r>
       <w:r>
@@ -2246,24 +2297,106 @@
       <w:bookmarkStart w:id="3" w:name="output"/>
       <w:bookmarkEnd w:id="2"/>
       <w:r>
-        <w:lastRenderedPageBreak/>
         <w:t>Output</w:t>
       </w:r>
     </w:p>
     <w:p>
       <w:pPr>
-        <w:pStyle w:val="FirstParagraph"/>
+        <w:pStyle w:val="BodyText"/>
       </w:pPr>
-      <w:r>
-        <w:t>A window with two text fields for input. Pressing the mouse shows the sum; releasing shows the difference in the result field.</w:t>
+      <w:bookmarkStart w:id="4" w:name="conclusion"/>
+      <w:bookmarkEnd w:id="3"/>
+      <w:r>
+        <w:rPr>
+          <w:noProof/>
+        </w:rPr>
+        <w:drawing>
+          <wp:inline distT="0" distB="0" distL="0" distR="0" wp14:anchorId="7763655F" wp14:editId="3B34F79B">
+            <wp:extent cx="2156647" cy="1729890"/>
+            <wp:effectExtent l="0" t="0" r="0" b="3810"/>
+            <wp:docPr id="747737175" name="Picture 1"/>
+            <wp:cNvGraphicFramePr>
+              <a:graphicFrameLocks xmlns:a="http://schemas.openxmlformats.org/drawingml/2006/main" noChangeAspect="1"/>
+            </wp:cNvGraphicFramePr>
+            <a:graphic xmlns:a="http://schemas.openxmlformats.org/drawingml/2006/main">
+              <a:graphicData uri="http://schemas.openxmlformats.org/drawingml/2006/picture">
+                <pic:pic xmlns:pic="http://schemas.openxmlformats.org/drawingml/2006/picture">
+                  <pic:nvPicPr>
+                    <pic:cNvPr id="747737175" name=""/>
+                    <pic:cNvPicPr/>
+                  </pic:nvPicPr>
+                  <pic:blipFill>
+                    <a:blip r:embed="rId9"/>
+                    <a:stretch>
+                      <a:fillRect/>
+                    </a:stretch>
+                  </pic:blipFill>
+                  <pic:spPr>
+                    <a:xfrm>
+                      <a:off x="0" y="0"/>
+                      <a:ext cx="2156647" cy="1729890"/>
+                    </a:xfrm>
+                    <a:prstGeom prst="rect">
+                      <a:avLst/>
+                    </a:prstGeom>
+                  </pic:spPr>
+                </pic:pic>
+              </a:graphicData>
+            </a:graphic>
+          </wp:inline>
+        </w:drawing>
+      </w:r>
+      <w:r>
+        <w:rPr>
+          <w:noProof/>
+        </w:rPr>
+        <w:t xml:space="preserve"> </w:t>
+      </w:r>
+      <w:r>
+        <w:rPr>
+          <w:noProof/>
+        </w:rPr>
+        <w:drawing>
+          <wp:inline distT="0" distB="0" distL="0" distR="0" wp14:anchorId="7A0BC627" wp14:editId="30BDC5FF">
+            <wp:extent cx="2171699" cy="1714500"/>
+            <wp:effectExtent l="0" t="0" r="0" b="0"/>
+            <wp:docPr id="1020903890" name="Picture 1"/>
+            <wp:cNvGraphicFramePr>
+              <a:graphicFrameLocks xmlns:a="http://schemas.openxmlformats.org/drawingml/2006/main" noChangeAspect="1"/>
+            </wp:cNvGraphicFramePr>
+            <a:graphic xmlns:a="http://schemas.openxmlformats.org/drawingml/2006/main">
+              <a:graphicData uri="http://schemas.openxmlformats.org/drawingml/2006/picture">
+                <pic:pic xmlns:pic="http://schemas.openxmlformats.org/drawingml/2006/picture">
+                  <pic:nvPicPr>
+                    <pic:cNvPr id="1020903890" name=""/>
+                    <pic:cNvPicPr/>
+                  </pic:nvPicPr>
+                  <pic:blipFill>
+                    <a:blip r:embed="rId10"/>
+                    <a:stretch>
+                      <a:fillRect/>
+                    </a:stretch>
+                  </pic:blipFill>
+                  <pic:spPr>
+                    <a:xfrm>
+                      <a:off x="0" y="0"/>
+                      <a:ext cx="2178248" cy="1719670"/>
+                    </a:xfrm>
+                    <a:prstGeom prst="rect">
+                      <a:avLst/>
+                    </a:prstGeom>
+                  </pic:spPr>
+                </pic:pic>
+              </a:graphicData>
+            </a:graphic>
+          </wp:inline>
+        </w:drawing>
       </w:r>
     </w:p>
     <w:p>
       <w:pPr>
         <w:pStyle w:val="Heading2"/>
       </w:pPr>
-      <w:bookmarkStart w:id="4" w:name="conclusion"/>
-      <w:bookmarkEnd w:id="3"/>
       <w:r>
         <w:t>Conclusion</w:t>
       </w:r>
@@ -56627,7 +56760,7 @@
       <w:bookmarkEnd w:id="146"/>
     </w:p>
     <w:sectPr>
-      <w:footerReference w:type="default" r:id="rId8"/>
+      <w:footerReference w:type="default" r:id="rId11"/>
       <w:footnotePr>
         <w:numRestart w:val="eachSect"/>
       </w:footnotePr>
@@ -57137,7 +57270,6 @@
     <w:next w:val="BodyText"/>
     <w:link w:val="Heading2Char"/>
     <w:uiPriority w:val="9"/>
-    <w:semiHidden/>
     <w:unhideWhenUsed/>
     <w:qFormat/>
     <w:rsid w:val="00A10FD9"/>
@@ -57339,6 +57471,7 @@
   <w:style w:type="paragraph" w:styleId="BodyText">
     <w:name w:val="Body Text"/>
     <w:basedOn w:val="Normal"/>
+    <w:link w:val="BodyTextChar"/>
     <w:qFormat/>
     <w:pPr>
       <w:spacing w:before="180" w:after="180"/>
@@ -57505,7 +57638,6 @@
     <w:basedOn w:val="DefaultParagraphFont"/>
     <w:link w:val="Heading2"/>
     <w:uiPriority w:val="9"/>
-    <w:semiHidden/>
     <w:rsid w:val="00A10FD9"/>
     <w:rPr>
       <w:rFonts w:asciiTheme="majorHAnsi" w:eastAsiaTheme="majorEastAsia" w:hAnsiTheme="majorHAnsi" w:cstheme="majorBidi"/>
@@ -58098,6 +58230,12 @@
     <w:uiPriority w:val="99"/>
     <w:rsid w:val="00B61CD5"/>
   </w:style>
+  <w:style w:type="character" w:customStyle="1" w:styleId="BodyTextChar">
+    <w:name w:val="Body Text Char"/>
+    <w:basedOn w:val="DefaultParagraphFont"/>
+    <w:link w:val="BodyText"/>
+    <w:rsid w:val="00AB62B8"/>
+  </w:style>
 </w:styles>
 </file>
 

</xml_diff>

<commit_message>
Refactor database operations in Ronish Java Lab Report and update SQL queries for consistency
</commit_message>
<xml_diff>
--- a/Labs/Ronish_Java_Lab_Report.docx
+++ b/Labs/Ronish_Java_Lab_Report.docx
@@ -2437,15 +2437,7 @@
         <w:pStyle w:val="FirstParagraph"/>
       </w:pPr>
       <w:r>
-        <w:t xml:space="preserve">Create a Swing JFrame with two input fields, a non-editable result field, and an “Add” button using </w:t>
-      </w:r>
-      <w:proofErr w:type="spellStart"/>
-      <w:r>
-        <w:t>GridLayout</w:t>
-      </w:r>
-      <w:proofErr w:type="spellEnd"/>
-      <w:r>
-        <w:t>.</w:t>
+        <w:t>Create a Swing JFrame with two input fields, a non-editable result field, and an “Add” button using GridLayout.</w:t>
       </w:r>
     </w:p>
     <w:p>
@@ -8175,35 +8167,17 @@
         <w:t xml:space="preserve"> </w:t>
       </w:r>
       <w:r>
-        <w:t xml:space="preserve">Create </w:t>
-      </w:r>
-      <w:proofErr w:type="gramStart"/>
-      <w:r>
-        <w:t>an</w:t>
-      </w:r>
-      <w:proofErr w:type="gramEnd"/>
-      <w:r>
-        <w:t xml:space="preserve"> </w:t>
-      </w:r>
-      <w:proofErr w:type="spellStart"/>
+        <w:t xml:space="preserve">Create an </w:t>
+      </w:r>
       <w:r>
         <w:t>J</w:t>
       </w:r>
       <w:r>
-        <w:t>Frame</w:t>
-      </w:r>
-      <w:proofErr w:type="spellEnd"/>
-      <w:r>
-        <w:t xml:space="preserve"> that implements</w:t>
-      </w:r>
-      <w:r>
-        <w:t xml:space="preserve"> </w:t>
-      </w:r>
-      <w:proofErr w:type="spellStart"/>
-      <w:r>
-        <w:t>MouseAdapter</w:t>
-      </w:r>
-      <w:proofErr w:type="spellEnd"/>
+        <w:t>Frame that implements</w:t>
+      </w:r>
+      <w:r>
+        <w:t xml:space="preserve"> MouseAdapter</w:t>
+      </w:r>
       <w:r>
         <w:t>. On mouse press, display the sum of two numbers. On mouse release, display the difference.</w:t>
       </w:r>
@@ -10479,7 +10453,10 @@
       <w:bookmarkStart w:id="19" w:name="conclusion-3"/>
       <w:bookmarkEnd w:id="18"/>
       <w:r>
-        <w:t>Conclusion</w:t>
+        <w:t>C</w:t>
+      </w:r>
+      <w:r>
+        <w:t>onclusion</w:t>
       </w:r>
     </w:p>
     <w:p>
@@ -10524,13 +10501,8 @@
         <w:pStyle w:val="FirstParagraph"/>
       </w:pPr>
       <w:r>
-        <w:t xml:space="preserve">Create a Swing login form with username and password fields using </w:t>
-      </w:r>
-      <w:proofErr w:type="spellStart"/>
-      <w:r>
-        <w:t>GridLayout</w:t>
-      </w:r>
-      <w:proofErr w:type="spellEnd"/>
+        <w:t>Create a Swing login form with username and password fields using GridLayout</w:t>
+      </w:r>
       <w:r>
         <w:t>.</w:t>
       </w:r>
@@ -11700,15 +11672,7 @@
         <w:pStyle w:val="FirstParagraph"/>
       </w:pPr>
       <w:r>
-        <w:t xml:space="preserve">Create a Swing login form using GridBagLayout with proper spacing using </w:t>
-      </w:r>
-      <w:proofErr w:type="spellStart"/>
-      <w:r>
-        <w:t>GridBagConstraints</w:t>
-      </w:r>
-      <w:proofErr w:type="spellEnd"/>
-      <w:r>
-        <w:t>.</w:t>
+        <w:t>Create a Swing login form using GridBagLayout with proper spacing using GridBagConstraints.</w:t>
       </w:r>
     </w:p>
     <w:p>
@@ -13538,23 +13502,7 @@
         <w:pStyle w:val="FirstParagraph"/>
       </w:pPr>
       <w:r>
-        <w:t xml:space="preserve">Login form with precise component positioning using </w:t>
-      </w:r>
-      <w:proofErr w:type="spellStart"/>
-      <w:r>
-        <w:t>GridBagLayout</w:t>
-      </w:r>
-      <w:proofErr w:type="spellEnd"/>
-      <w:r>
-        <w:t xml:space="preserve"> and 5px </w:t>
-      </w:r>
-      <w:proofErr w:type="gramStart"/>
-      <w:r>
-        <w:t>insets</w:t>
-      </w:r>
-      <w:proofErr w:type="gramEnd"/>
-      <w:r>
-        <w:t>.</w:t>
+        <w:t>Login form with precise component positioning using GridBagLayout and 5px insets.</w:t>
       </w:r>
     </w:p>
     <w:p>
@@ -21666,7 +21614,6 @@
       <w:pPr>
         <w:pStyle w:val="BodyText"/>
       </w:pPr>
-      <w:proofErr w:type="gramStart"/>
       <w:r>
         <w:t xml:space="preserve">Create </w:t>
       </w:r>
@@ -21674,49 +21621,16 @@
         <w:t xml:space="preserve"> </w:t>
       </w:r>
       <w:r>
-        <w:t>a</w:t>
-      </w:r>
-      <w:proofErr w:type="gramEnd"/>
-      <w:r>
-        <w:t xml:space="preserve"> </w:t>
-      </w:r>
-      <w:proofErr w:type="spellStart"/>
-      <w:r>
-        <w:t>JFrame</w:t>
-      </w:r>
-      <w:proofErr w:type="spellEnd"/>
-      <w:r>
-        <w:t xml:space="preserve"> with</w:t>
-      </w:r>
-      <w:r>
-        <w:t xml:space="preserve"> </w:t>
-      </w:r>
-      <w:r>
-        <w:t>the use of different layout managers (</w:t>
-      </w:r>
-      <w:proofErr w:type="spellStart"/>
-      <w:r>
-        <w:t>FlowLayout</w:t>
-      </w:r>
-      <w:proofErr w:type="spellEnd"/>
-      <w:r>
-        <w:t xml:space="preserve">, </w:t>
-      </w:r>
-      <w:proofErr w:type="spellStart"/>
-      <w:r>
-        <w:t>GridLayout</w:t>
-      </w:r>
-      <w:proofErr w:type="spellEnd"/>
-      <w:r>
-        <w:t xml:space="preserve">, and </w:t>
-      </w:r>
-      <w:proofErr w:type="spellStart"/>
-      <w:r>
-        <w:t>BorderLayout</w:t>
-      </w:r>
-      <w:proofErr w:type="spellEnd"/>
-      <w:r>
-        <w:t>).</w:t>
+        <w:t xml:space="preserve">a </w:t>
+      </w:r>
+      <w:r>
+        <w:t>JFrame with</w:t>
+      </w:r>
+      <w:r>
+        <w:t xml:space="preserve"> </w:t>
+      </w:r>
+      <w:r>
+        <w:t>the use of different layout managers (FlowLayout, GridLayout, and BorderLayout).</w:t>
       </w:r>
     </w:p>
     <w:p>
@@ -21728,15 +21642,7 @@
         </w:numPr>
       </w:pPr>
       <w:r>
-        <w:t xml:space="preserve">  Divide the main frame into three panels using </w:t>
-      </w:r>
-      <w:proofErr w:type="spellStart"/>
-      <w:r>
-        <w:t>BorderLayout</w:t>
-      </w:r>
-      <w:proofErr w:type="spellEnd"/>
-      <w:r>
-        <w:t>:</w:t>
+        <w:t>  Divide the main frame into three panels using BorderLayout:</w:t>
       </w:r>
     </w:p>
     <w:p>
@@ -21748,15 +21654,7 @@
         </w:numPr>
       </w:pPr>
       <w:r>
-        <w:t xml:space="preserve">   North Panel: Use </w:t>
-      </w:r>
-      <w:proofErr w:type="spellStart"/>
-      <w:r>
-        <w:t>FlowLayout</w:t>
-      </w:r>
-      <w:proofErr w:type="spellEnd"/>
-      <w:r>
-        <w:t xml:space="preserve"> to arrange three labels (Name, Roll No, Class) in a single row.</w:t>
+        <w:t xml:space="preserve">   North Panel: Use FlowLayout to arrange three labels (Name, Roll No, Class) in a single row.</w:t>
       </w:r>
     </w:p>
     <w:p>
@@ -21768,31 +21666,7 @@
         </w:numPr>
       </w:pPr>
       <w:r>
-        <w:t xml:space="preserve">   Center Panel: Use </w:t>
-      </w:r>
-      <w:proofErr w:type="spellStart"/>
-      <w:r>
-        <w:t>GridLayout</w:t>
-      </w:r>
-      <w:proofErr w:type="spellEnd"/>
-      <w:r>
-        <w:t xml:space="preserve"> (3x2) to create a simple login form with two text fields (Username, Password), a </w:t>
-      </w:r>
-      <w:proofErr w:type="spellStart"/>
-      <w:r>
-        <w:t>JCheckBox</w:t>
-      </w:r>
-      <w:proofErr w:type="spellEnd"/>
-      <w:r>
-        <w:t xml:space="preserve"> (“Remember Me”), and a </w:t>
-      </w:r>
-      <w:proofErr w:type="spellStart"/>
-      <w:r>
-        <w:t>JButton</w:t>
-      </w:r>
-      <w:proofErr w:type="spellEnd"/>
-      <w:r>
-        <w:t xml:space="preserve"> (“Login”).</w:t>
+        <w:t xml:space="preserve">   Center Panel: Use GridLayout (3x2) to create a simple login form with two text fields (Username, Password), a JCheckBox (“Remember Me”), and a JButton (“Login”).</w:t>
       </w:r>
     </w:p>
     <w:p>
@@ -21804,15 +21678,7 @@
         </w:numPr>
       </w:pPr>
       <w:r>
-        <w:t xml:space="preserve">  South Panel: Use </w:t>
-      </w:r>
-      <w:proofErr w:type="spellStart"/>
-      <w:r>
-        <w:t>FlowLayout</w:t>
-      </w:r>
-      <w:proofErr w:type="spellEnd"/>
-      <w:r>
-        <w:t xml:space="preserve"> to add two buttons (Reset and Exit).</w:t>
+        <w:t>  South Panel: Use FlowLayout to add two buttons (Reset and Exit).</w:t>
       </w:r>
     </w:p>
     <w:p>
@@ -22690,209 +22556,185 @@
           <w:rStyle w:val="NormalTok"/>
           <w:sz w:val="18"/>
         </w:rPr>
+        <w:t xml:space="preserve">        north</w:t>
+      </w:r>
+      <w:r>
+        <w:rPr>
+          <w:rStyle w:val="OperatorTok"/>
+          <w:sz w:val="18"/>
+        </w:rPr>
+        <w:t>.</w:t>
+      </w:r>
+      <w:r>
+        <w:rPr>
+          <w:rStyle w:val="FunctionTok"/>
+          <w:sz w:val="18"/>
+        </w:rPr>
+        <w:t>add</w:t>
+      </w:r>
+      <w:r>
+        <w:rPr>
+          <w:rStyle w:val="OperatorTok"/>
+          <w:sz w:val="18"/>
+        </w:rPr>
+        <w:t>(</w:t>
+      </w:r>
+      <w:r>
+        <w:rPr>
+          <w:rStyle w:val="KeywordTok"/>
+          <w:sz w:val="18"/>
+        </w:rPr>
+        <w:t>new</w:t>
+      </w:r>
+      <w:r>
+        <w:rPr>
+          <w:rStyle w:val="NormalTok"/>
+          <w:sz w:val="18"/>
+        </w:rPr>
+        <w:t xml:space="preserve"> </w:t>
+      </w:r>
+      <w:r>
+        <w:rPr>
+          <w:rStyle w:val="BuiltInTok"/>
+          <w:sz w:val="18"/>
+        </w:rPr>
+        <w:t>JLabel</w:t>
+      </w:r>
+      <w:r>
+        <w:rPr>
+          <w:rStyle w:val="OperatorTok"/>
+          <w:sz w:val="18"/>
+        </w:rPr>
+        <w:t>(</w:t>
+      </w:r>
+      <w:r>
+        <w:rPr>
+          <w:rStyle w:val="StringTok"/>
+          <w:sz w:val="18"/>
+        </w:rPr>
+        <w:t xml:space="preserve">"Class: </w:t>
+      </w:r>
+      <w:r>
+        <w:rPr>
+          <w:rStyle w:val="StringTok"/>
+          <w:sz w:val="18"/>
+        </w:rPr>
+        <w:t>CSIT</w:t>
+      </w:r>
+      <w:r>
+        <w:rPr>
+          <w:rStyle w:val="StringTok"/>
+          <w:sz w:val="18"/>
+        </w:rPr>
+        <w:t>"</w:t>
+      </w:r>
+      <w:r>
+        <w:rPr>
+          <w:rStyle w:val="OperatorTok"/>
+          <w:sz w:val="18"/>
+        </w:rPr>
+        <w:t>));</w:t>
+      </w:r>
+      <w:r>
+        <w:br/>
+      </w:r>
+      <w:r>
+        <w:rPr>
+          <w:rStyle w:val="NormalTok"/>
+          <w:sz w:val="18"/>
+        </w:rPr>
+        <w:t xml:space="preserve">        f</w:t>
+      </w:r>
+      <w:r>
+        <w:rPr>
+          <w:rStyle w:val="OperatorTok"/>
+          <w:sz w:val="18"/>
+        </w:rPr>
+        <w:t>.</w:t>
+      </w:r>
+      <w:r>
+        <w:rPr>
+          <w:rStyle w:val="FunctionTok"/>
+          <w:sz w:val="18"/>
+        </w:rPr>
+        <w:t>add</w:t>
+      </w:r>
+      <w:r>
+        <w:rPr>
+          <w:rStyle w:val="OperatorTok"/>
+          <w:sz w:val="18"/>
+        </w:rPr>
+        <w:t>(</w:t>
+      </w:r>
+      <w:r>
+        <w:rPr>
+          <w:rStyle w:val="NormalTok"/>
+          <w:sz w:val="18"/>
+        </w:rPr>
+        <w:t>north</w:t>
+      </w:r>
+      <w:r>
+        <w:rPr>
+          <w:rStyle w:val="OperatorTok"/>
+          <w:sz w:val="18"/>
+        </w:rPr>
+        <w:t>,</w:t>
+      </w:r>
+      <w:r>
+        <w:rPr>
+          <w:rStyle w:val="NormalTok"/>
+          <w:sz w:val="18"/>
+        </w:rPr>
+        <w:t xml:space="preserve"> </w:t>
+      </w:r>
+      <w:r>
+        <w:rPr>
+          <w:rStyle w:val="BuiltInTok"/>
+          <w:sz w:val="18"/>
+        </w:rPr>
+        <w:t>BorderLayout</w:t>
+      </w:r>
+      <w:r>
+        <w:rPr>
+          <w:rStyle w:val="OperatorTok"/>
+          <w:sz w:val="18"/>
+        </w:rPr>
+        <w:t>.</w:t>
+      </w:r>
+      <w:r>
+        <w:rPr>
+          <w:rStyle w:val="FunctionTok"/>
+          <w:sz w:val="18"/>
+        </w:rPr>
+        <w:t>NORTH</w:t>
+      </w:r>
+      <w:r>
+        <w:rPr>
+          <w:rStyle w:val="OperatorTok"/>
+          <w:sz w:val="18"/>
+        </w:rPr>
+        <w:t>);</w:t>
+      </w:r>
+      <w:r>
+        <w:br/>
+      </w:r>
+      <w:r>
+        <w:br/>
+      </w:r>
+      <w:r>
+        <w:rPr>
+          <w:rStyle w:val="NormalTok"/>
+          <w:sz w:val="18"/>
+        </w:rPr>
         <w:t xml:space="preserve">        </w:t>
       </w:r>
-      <w:proofErr w:type="spellStart"/>
-      <w:r>
-        <w:rPr>
-          <w:rStyle w:val="NormalTok"/>
-          <w:sz w:val="18"/>
-        </w:rPr>
-        <w:t>north</w:t>
-      </w:r>
-      <w:r>
-        <w:rPr>
-          <w:rStyle w:val="OperatorTok"/>
-          <w:sz w:val="18"/>
-        </w:rPr>
-        <w:t>.</w:t>
-      </w:r>
-      <w:r>
-        <w:rPr>
-          <w:rStyle w:val="FunctionTok"/>
-          <w:sz w:val="18"/>
-        </w:rPr>
-        <w:t>add</w:t>
-      </w:r>
-      <w:proofErr w:type="spellEnd"/>
-      <w:r>
-        <w:rPr>
-          <w:rStyle w:val="OperatorTok"/>
-          <w:sz w:val="18"/>
-        </w:rPr>
-        <w:t>(</w:t>
-      </w:r>
-      <w:r>
-        <w:rPr>
-          <w:rStyle w:val="KeywordTok"/>
-          <w:sz w:val="18"/>
-        </w:rPr>
-        <w:t>new</w:t>
-      </w:r>
-      <w:r>
-        <w:rPr>
-          <w:rStyle w:val="NormalTok"/>
-          <w:sz w:val="18"/>
-        </w:rPr>
-        <w:t xml:space="preserve"> </w:t>
-      </w:r>
-      <w:proofErr w:type="spellStart"/>
       <w:r>
         <w:rPr>
           <w:rStyle w:val="BuiltInTok"/>
           <w:sz w:val="18"/>
         </w:rPr>
-        <w:t>JLabel</w:t>
-      </w:r>
-      <w:proofErr w:type="spellEnd"/>
-      <w:r>
-        <w:rPr>
-          <w:rStyle w:val="OperatorTok"/>
-          <w:sz w:val="18"/>
-        </w:rPr>
-        <w:t>(</w:t>
-      </w:r>
-      <w:r>
-        <w:rPr>
-          <w:rStyle w:val="StringTok"/>
-          <w:sz w:val="18"/>
-        </w:rPr>
-        <w:t xml:space="preserve">"Class: </w:t>
-      </w:r>
-      <w:r>
-        <w:rPr>
-          <w:rStyle w:val="StringTok"/>
-          <w:sz w:val="18"/>
-        </w:rPr>
-        <w:t>CSIT</w:t>
-      </w:r>
-      <w:r>
-        <w:rPr>
-          <w:rStyle w:val="StringTok"/>
-          <w:sz w:val="18"/>
-        </w:rPr>
-        <w:t>"</w:t>
-      </w:r>
-      <w:r>
-        <w:rPr>
-          <w:rStyle w:val="OperatorTok"/>
-          <w:sz w:val="18"/>
-        </w:rPr>
-        <w:t>));</w:t>
-      </w:r>
-      <w:r>
-        <w:br/>
-      </w:r>
-      <w:r>
-        <w:rPr>
-          <w:rStyle w:val="NormalTok"/>
-          <w:sz w:val="18"/>
-        </w:rPr>
-        <w:t xml:space="preserve">        </w:t>
-      </w:r>
-      <w:proofErr w:type="spellStart"/>
-      <w:r>
-        <w:rPr>
-          <w:rStyle w:val="NormalTok"/>
-          <w:sz w:val="18"/>
-        </w:rPr>
-        <w:t>f</w:t>
-      </w:r>
-      <w:r>
-        <w:rPr>
-          <w:rStyle w:val="OperatorTok"/>
-          <w:sz w:val="18"/>
-        </w:rPr>
-        <w:t>.</w:t>
-      </w:r>
-      <w:r>
-        <w:rPr>
-          <w:rStyle w:val="FunctionTok"/>
-          <w:sz w:val="18"/>
-        </w:rPr>
-        <w:t>add</w:t>
-      </w:r>
-      <w:proofErr w:type="spellEnd"/>
-      <w:r>
-        <w:rPr>
-          <w:rStyle w:val="OperatorTok"/>
-          <w:sz w:val="18"/>
-        </w:rPr>
-        <w:t>(</w:t>
-      </w:r>
-      <w:r>
-        <w:rPr>
-          <w:rStyle w:val="NormalTok"/>
-          <w:sz w:val="18"/>
-        </w:rPr>
-        <w:t>north</w:t>
-      </w:r>
-      <w:r>
-        <w:rPr>
-          <w:rStyle w:val="OperatorTok"/>
-          <w:sz w:val="18"/>
-        </w:rPr>
-        <w:t>,</w:t>
-      </w:r>
-      <w:r>
-        <w:rPr>
-          <w:rStyle w:val="NormalTok"/>
-          <w:sz w:val="18"/>
-        </w:rPr>
-        <w:t xml:space="preserve"> </w:t>
-      </w:r>
-      <w:proofErr w:type="spellStart"/>
-      <w:r>
-        <w:rPr>
-          <w:rStyle w:val="BuiltInTok"/>
-          <w:sz w:val="18"/>
-        </w:rPr>
-        <w:t>BorderLayout</w:t>
-      </w:r>
-      <w:r>
-        <w:rPr>
-          <w:rStyle w:val="OperatorTok"/>
-          <w:sz w:val="18"/>
-        </w:rPr>
-        <w:t>.</w:t>
-      </w:r>
-      <w:r>
-        <w:rPr>
-          <w:rStyle w:val="FunctionTok"/>
-          <w:sz w:val="18"/>
-        </w:rPr>
-        <w:t>NORTH</w:t>
-      </w:r>
-      <w:proofErr w:type="spellEnd"/>
-      <w:r>
-        <w:rPr>
-          <w:rStyle w:val="OperatorTok"/>
-          <w:sz w:val="18"/>
-        </w:rPr>
-        <w:t>);</w:t>
-      </w:r>
-      <w:r>
-        <w:br/>
-      </w:r>
-      <w:r>
-        <w:br/>
-      </w:r>
-      <w:r>
-        <w:rPr>
-          <w:rStyle w:val="NormalTok"/>
-          <w:sz w:val="18"/>
-        </w:rPr>
-        <w:t xml:space="preserve">        </w:t>
-      </w:r>
-      <w:proofErr w:type="spellStart"/>
-      <w:r>
-        <w:rPr>
-          <w:rStyle w:val="BuiltInTok"/>
-          <w:sz w:val="18"/>
-        </w:rPr>
         <w:t>JPanel</w:t>
       </w:r>
-      <w:proofErr w:type="spellEnd"/>
       <w:r>
         <w:rPr>
           <w:rStyle w:val="NormalTok"/>
@@ -25395,15 +25237,7 @@
         <w:pStyle w:val="FirstParagraph"/>
       </w:pPr>
       <w:r>
-        <w:t xml:space="preserve">Top panel shows student info, center has login form with Remember Me checkbox, bottom has Reset and Exit buttons. Login shows a dialog, </w:t>
-      </w:r>
-      <w:proofErr w:type="gramStart"/>
-      <w:r>
-        <w:t>Reset</w:t>
-      </w:r>
-      <w:proofErr w:type="gramEnd"/>
-      <w:r>
-        <w:t xml:space="preserve"> clears fields, Exit closes the app.</w:t>
+        <w:t>Top panel shows student info, center has login form with Remember Me checkbox, bottom has Reset and Exit buttons. Login shows a dialog, Reset clears fields, Exit closes the app.</w:t>
       </w:r>
     </w:p>
     <w:p>
@@ -31061,15 +30895,7 @@
       <w:bookmarkEnd w:id="59"/>
       <w:r>
         <w:lastRenderedPageBreak/>
-        <w:t xml:space="preserve">Lab 12: </w:t>
-      </w:r>
-      <w:proofErr w:type="spellStart"/>
-      <w:r>
-        <w:t>JToolBar</w:t>
-      </w:r>
-      <w:proofErr w:type="spellEnd"/>
-      <w:r>
-        <w:t xml:space="preserve"> with Programmatically Generated Icon Buttons</w:t>
+        <w:t>Lab 12: JToolBar with Programmatically Generated Icon Buttons</w:t>
       </w:r>
     </w:p>
     <w:p>
@@ -31078,7 +30904,10 @@
       </w:pPr>
       <w:bookmarkStart w:id="61" w:name="objective-12"/>
       <w:r>
-        <w:t>Objective</w:t>
+        <w:t>O</w:t>
+      </w:r>
+      <w:r>
+        <w:t>bjective</w:t>
       </w:r>
     </w:p>
     <w:p>
@@ -34321,6 +34150,43 @@
       <w:pPr>
         <w:pStyle w:val="BodyText"/>
       </w:pPr>
+      <w:r>
+        <w:drawing>
+          <wp:inline distT="0" distB="0" distL="0" distR="0" wp14:anchorId="09F1D78A" wp14:editId="0C2337BA">
+            <wp:extent cx="2800350" cy="2010029"/>
+            <wp:effectExtent l="0" t="0" r="0" b="0"/>
+            <wp:docPr id="853042765" name="Picture 1"/>
+            <wp:cNvGraphicFramePr>
+              <a:graphicFrameLocks xmlns:a="http://schemas.openxmlformats.org/drawingml/2006/main" noChangeAspect="1"/>
+            </wp:cNvGraphicFramePr>
+            <a:graphic xmlns:a="http://schemas.openxmlformats.org/drawingml/2006/main">
+              <a:graphicData uri="http://schemas.openxmlformats.org/drawingml/2006/picture">
+                <pic:pic xmlns:pic="http://schemas.openxmlformats.org/drawingml/2006/picture">
+                  <pic:nvPicPr>
+                    <pic:cNvPr id="853042765" name=""/>
+                    <pic:cNvPicPr/>
+                  </pic:nvPicPr>
+                  <pic:blipFill>
+                    <a:blip r:embed="rId45"/>
+                    <a:stretch>
+                      <a:fillRect/>
+                    </a:stretch>
+                  </pic:blipFill>
+                  <pic:spPr>
+                    <a:xfrm>
+                      <a:off x="0" y="0"/>
+                      <a:ext cx="2803413" cy="2012227"/>
+                    </a:xfrm>
+                    <a:prstGeom prst="rect">
+                      <a:avLst/>
+                    </a:prstGeom>
+                  </pic:spPr>
+                </pic:pic>
+              </a:graphicData>
+            </a:graphic>
+          </wp:inline>
+        </w:drawing>
+      </w:r>
     </w:p>
     <w:p>
       <w:pPr>
@@ -34785,7 +34651,91 @@
           <w:rStyle w:val="StringTok"/>
           <w:sz w:val="18"/>
         </w:rPr>
-        <w:t>"INSERT INTO student (id, name, gender, address) VALUES (?, ?, ?, ?)"</w:t>
+        <w:t xml:space="preserve">"INSERT INTO </w:t>
+      </w:r>
+      <w:r>
+        <w:rPr>
+          <w:rStyle w:val="StringTok"/>
+          <w:sz w:val="18"/>
+        </w:rPr>
+        <w:t>tblS</w:t>
+      </w:r>
+      <w:r>
+        <w:rPr>
+          <w:rStyle w:val="StringTok"/>
+          <w:sz w:val="18"/>
+        </w:rPr>
+        <w:t>tudent (</w:t>
+      </w:r>
+      <w:r>
+        <w:rPr>
+          <w:rStyle w:val="StringTok"/>
+          <w:sz w:val="18"/>
+        </w:rPr>
+        <w:t xml:space="preserve">id, </w:t>
+      </w:r>
+      <w:r>
+        <w:rPr>
+          <w:rStyle w:val="StringTok"/>
+          <w:sz w:val="18"/>
+        </w:rPr>
+        <w:t>name,</w:t>
+      </w:r>
+      <w:r>
+        <w:rPr>
+          <w:rStyle w:val="StringTok"/>
+          <w:sz w:val="18"/>
+        </w:rPr>
+        <w:t xml:space="preserve"> </w:t>
+      </w:r>
+      <w:r>
+        <w:rPr>
+          <w:rStyle w:val="StringTok"/>
+          <w:sz w:val="18"/>
+        </w:rPr>
+        <w:t>gender,</w:t>
+      </w:r>
+      <w:r>
+        <w:rPr>
+          <w:rStyle w:val="StringTok"/>
+          <w:sz w:val="18"/>
+        </w:rPr>
+        <w:t>address) VALUES (?,</w:t>
+      </w:r>
+      <w:r>
+        <w:rPr>
+          <w:rStyle w:val="StringTok"/>
+          <w:sz w:val="18"/>
+        </w:rPr>
+        <w:t>?,</w:t>
+      </w:r>
+      <w:r>
+        <w:rPr>
+          <w:rStyle w:val="StringTok"/>
+          <w:sz w:val="18"/>
+        </w:rPr>
+        <w:t>?</w:t>
+      </w:r>
+      <w:r>
+        <w:rPr>
+          <w:rStyle w:val="StringTok"/>
+          <w:sz w:val="18"/>
+        </w:rPr>
+        <w:t>,?</w:t>
+      </w:r>
+      <w:r>
+        <w:rPr>
+          <w:rStyle w:val="StringTok"/>
+          <w:sz w:val="18"/>
+        </w:rPr>
+        <w:t>)</w:t>
+      </w:r>
+      <w:r>
+        <w:rPr>
+          <w:rStyle w:val="StringTok"/>
+          <w:sz w:val="18"/>
+        </w:rPr>
+        <w:t>"</w:t>
       </w:r>
       <w:r>
         <w:rPr>
@@ -37093,6 +37043,7 @@
           <w:rStyle w:val="NormalTok"/>
           <w:sz w:val="18"/>
         </w:rPr>
+        <w:lastRenderedPageBreak/>
         <w:t xml:space="preserve">        </w:t>
       </w:r>
       <w:r>
@@ -37179,72 +37130,41 @@
         <w:pStyle w:val="SourceCode"/>
       </w:pPr>
       <w:r>
-        <w:rPr>
-          <w:rStyle w:val="VerbatimChar"/>
-          <w:sz w:val="18"/>
-        </w:rPr>
-        <w:t>ID      Name            Gender          Address</w:t>
-      </w:r>
-      <w:r>
-        <w:br/>
-      </w:r>
-      <w:r>
-        <w:rPr>
-          <w:rStyle w:val="VerbatimChar"/>
-          <w:sz w:val="18"/>
-        </w:rPr>
-        <w:t>----------------------------------------------</w:t>
-      </w:r>
-      <w:r>
-        <w:br/>
-      </w:r>
-      <w:r>
-        <w:rPr>
-          <w:rStyle w:val="VerbatimChar"/>
-          <w:sz w:val="18"/>
-        </w:rPr>
-        <w:t>4       Gita            Female          Bharatpur</w:t>
-      </w:r>
-      <w:r>
-        <w:br/>
-      </w:r>
-      <w:r>
-        <w:rPr>
-          <w:rStyle w:val="VerbatimChar"/>
-          <w:sz w:val="18"/>
-        </w:rPr>
-        <w:t>3       Hari            Male            Lalitpur</w:t>
-      </w:r>
-      <w:r>
-        <w:br/>
-      </w:r>
-      <w:r>
-        <w:rPr>
-          <w:rStyle w:val="VerbatimChar"/>
-          <w:sz w:val="18"/>
-        </w:rPr>
-        <w:t>1       Ram             Male            Kathmandu</w:t>
-      </w:r>
-      <w:r>
-        <w:br/>
-      </w:r>
-      <w:r>
-        <w:rPr>
-          <w:rStyle w:val="VerbatimChar"/>
-          <w:sz w:val="18"/>
-        </w:rPr>
-        <w:lastRenderedPageBreak/>
-        <w:t>5       Shyam           Male            Biratnagar</w:t>
-      </w:r>
-      <w:r>
-        <w:br/>
-      </w:r>
-      <w:r>
-        <w:rPr>
-          <w:rStyle w:val="VerbatimChar"/>
-          <w:sz w:val="18"/>
-        </w:rPr>
-        <w:t>2       Sita            Female          Pokhara</w:t>
+        <w:drawing>
+          <wp:inline distT="0" distB="0" distL="0" distR="0" wp14:anchorId="7CCE3F3F" wp14:editId="3F4F0A18">
+            <wp:extent cx="5943600" cy="2334260"/>
+            <wp:effectExtent l="0" t="0" r="0" b="0"/>
+            <wp:docPr id="1999176015" name="Picture 1"/>
+            <wp:cNvGraphicFramePr>
+              <a:graphicFrameLocks xmlns:a="http://schemas.openxmlformats.org/drawingml/2006/main" noChangeAspect="1"/>
+            </wp:cNvGraphicFramePr>
+            <a:graphic xmlns:a="http://schemas.openxmlformats.org/drawingml/2006/main">
+              <a:graphicData uri="http://schemas.openxmlformats.org/drawingml/2006/picture">
+                <pic:pic xmlns:pic="http://schemas.openxmlformats.org/drawingml/2006/picture">
+                  <pic:nvPicPr>
+                    <pic:cNvPr id="1999176015" name=""/>
+                    <pic:cNvPicPr/>
+                  </pic:nvPicPr>
+                  <pic:blipFill>
+                    <a:blip r:embed="rId46"/>
+                    <a:stretch>
+                      <a:fillRect/>
+                    </a:stretch>
+                  </pic:blipFill>
+                  <pic:spPr>
+                    <a:xfrm>
+                      <a:off x="0" y="0"/>
+                      <a:ext cx="5943600" cy="2334260"/>
+                    </a:xfrm>
+                    <a:prstGeom prst="rect">
+                      <a:avLst/>
+                    </a:prstGeom>
+                  </pic:spPr>
+                </pic:pic>
+              </a:graphicData>
+            </a:graphic>
+          </wp:inline>
+        </w:drawing>
       </w:r>
     </w:p>
     <w:p>
@@ -58530,7 +58450,7 @@
       <w:bookmarkEnd w:id="146"/>
     </w:p>
     <w:sectPr>
-      <w:footerReference w:type="default" r:id="rId45"/>
+      <w:footerReference w:type="default" r:id="rId47"/>
       <w:footnotePr>
         <w:numRestart w:val="eachSect"/>
       </w:footnotePr>

</xml_diff>